<commit_message>
Results folder: render nested bullets correctly in the Word files
Claude-Session: https://claude.ai/code/session_01VCh7XeJpj5JpCzQtSzh7gK
</commit_message>
<xml_diff>
--- a/AESOP_RESULTS_2026-10-18/00_START_HERE_Aesop_Results.docx
+++ b/AESOP_RESULTS_2026-10-18/00_START_HERE_Aesop_Results.docx
@@ -233,13 +233,19 @@
       </w:r>
     </w:p>
     <w:p>
+      <w:pPr>
+        <w:pStyle w:val="ListBullet2"/>
+      </w:pPr>
       <w:r>
-        <w:t xml:space="preserve">  - each set vs guessing: a permutation test;</w:t>
+        <w:t>each set vs guessing: a permutation test;</w:t>
       </w:r>
     </w:p>
     <w:p>
+      <w:pPr>
+        <w:pStyle w:val="ListBullet2"/>
+      </w:pPr>
       <w:r>
-        <w:t xml:space="preserve">  - set vs set: a fable-level paired permutation test, plus a model-level test across 4 vs 4 training runs.</w:t>
+        <w:t>set vs set: a fable-level paired permutation test, plus a model-level test across 4 vs 4 training runs.</w:t>
       </w:r>
     </w:p>
     <w:p>

</xml_diff>